<commit_message>
Mirror Journal of Anesthesia Version in the Russian Translation
Russian main text, back matter and supplementary sections S6–S7 follow the shortened English
version; PDF and DOCX rebuilt.

Co-Authored-By: Claude Opus 5.5 <noreply@anthropic.com>
</commit_message>
<xml_diff>
--- a/paper/supplement_ru.docx
+++ b/paper/supplement_ru.docx
@@ -2,6 +2,24 @@
 <file path=word/document.xml><?xml version="1.0" encoding="utf-8"?>
 <w:document xmlns:w="http://schemas.openxmlformats.org/wordprocessingml/2006/main" xmlns:m="http://schemas.openxmlformats.org/officeDocument/2006/math" xmlns:r="http://schemas.openxmlformats.org/officeDocument/2006/relationships" xmlns:o="urn:schemas-microsoft-com:office:office" xmlns:v="urn:schemas-microsoft-com:vml" xmlns:w10="urn:schemas-microsoft-com:office:word" xmlns:a="http://schemas.openxmlformats.org/drawingml/2006/main" xmlns:pic="http://schemas.openxmlformats.org/drawingml/2006/picture" xmlns:wp="http://schemas.openxmlformats.org/drawingml/2006/wordprocessingDrawing">
   <w:body>
+    <w:p>
+      <w:pPr>
+        <w:pStyle w:val="FirstParagraph"/>
+      </w:pPr>
+      <w:r>
+        <w:rPr>
+          <w:b/>
+          <w:bCs/>
+        </w:rPr>
+        <w:t xml:space="preserve">Электронное приложение 1</w:t>
+      </w:r>
+      <w:r>
+        <w:t xml:space="preserve"> </w:t>
+      </w:r>
+      <w:r>
+        <w:t xml:space="preserve">к статье «Какая доля зарегистрированной интраоперационной гипотензии является артефактом артериальной линии и искажает ли это её связь с острым повреждением почек, определённым по креатинину? Когортное исследование с эталоном по кривой артериального давления» (Oleg Tropynin). Дополнительные методы S1–S7, таблицы S1–S11, рисунки S1–S4 и протокол анализа.</w:t>
+      </w:r>
+    </w:p>
     <w:p>
       <w:pPr>
         <w:pStyle w:val="Heading1"/>
@@ -598,23 +616,743 @@
     </w:p>
     <w:p>
       <w:pPr>
-        <w:pStyle w:val="Heading1"/>
+        <w:pStyle w:val="Heading2"/>
       </w:pPr>
-      <w:bookmarkStart w:id="15" w:name="_6a192ab095230096d452e33d378527ac22c9cab"/>
-      <w:r>
-        <w:t xml:space="preserve">Дополнительные таблицы</w:t>
+      <w:bookmarkStart w:id="15" w:name="_787d98b730ae74a0de14d3a0da4b2e956aa13d9"/>
+      <w:r>
+        <w:t xml:space="preserve">S6. Фильтры конвейеров обработки и анализы чувствительности</w:t>
       </w:r>
       <w:bookmarkEnd w:id="15"/>
+    </w:p>
+    <w:p>
+      <w:pPr>
+        <w:pStyle w:val="FirstParagraph"/>
+      </w:pPr>
+      <w:r>
+        <w:t xml:space="preserve">Фильтры применяли к 2-секундным числовым данным монитора (F5 и F6 — после дискретизации, на</w:t>
+      </w:r>
+      <w:r>
+        <w:t xml:space="preserve"> </w:t>
+      </w:r>
+      <w:r>
+        <w:t xml:space="preserve">собственной сетке конвейера):</w:t>
+      </w:r>
+      <w:r>
+        <w:t xml:space="preserve"> </w:t>
+      </w:r>
+      <w:r>
+        <w:t xml:space="preserve">- F0: без фильтра;</w:t>
+      </w:r>
+      <w:r>
+        <w:t xml:space="preserve"> </w:t>
+      </w:r>
+      <w:r>
+        <w:t xml:space="preserve">- F1: удаление САД ниже 20 или выше 250 мм рт. ст.;</w:t>
+      </w:r>
+      <w:r>
+        <w:t xml:space="preserve">[@leesb]</w:t>
+      </w:r>
+      <w:r>
+        <w:t xml:space="preserve"> </w:t>
+      </w:r>
+      <w:r>
+        <w:t xml:space="preserve">- F2: удаление САД ниже 30 или выше 200 мм рт. ст.;</w:t>
+      </w:r>
+      <w:r>
+        <w:t xml:space="preserve">[@khan]</w:t>
+      </w:r>
+      <w:r>
+        <w:t xml:space="preserve"> </w:t>
+      </w:r>
+      <w:r>
+        <w:t xml:space="preserve">- F3: удаление значений при систолическом выше 250, диастолическом ниже 15, САД ниже 35 или выше 150</w:t>
+      </w:r>
+      <w:r>
+        <w:t xml:space="preserve"> </w:t>
+      </w:r>
+      <w:r>
+        <w:t xml:space="preserve">либо пульсовом давлении ниже 15 мм рт. ст.;</w:t>
+      </w:r>
+      <w:r>
+        <w:t xml:space="preserve">[@jacobsson]</w:t>
+      </w:r>
+      <w:r>
+        <w:t xml:space="preserve"> </w:t>
+      </w:r>
+      <w:r>
+        <w:t xml:space="preserve">- F4: физиологическая согласованность (САД ниже 20 или выше 200; систолическое ниже 20 или выше 300;</w:t>
+      </w:r>
+      <w:r>
+        <w:t xml:space="preserve"> </w:t>
+      </w:r>
+      <w:r>
+        <w:t xml:space="preserve">систолическое ≤ диастолического; пульсовое давление ниже 5; диастолическое ниже 5);</w:t>
+      </w:r>
+      <w:r>
+        <w:t xml:space="preserve"> </w:t>
+      </w:r>
+      <w:r>
+        <w:t xml:space="preserve">- F5: F4, затем удаление значений, отличающихся от обоих соседних более чем на 30 мм рт. ст.;</w:t>
+      </w:r>
+      <w:r>
+        <w:t xml:space="preserve">[@du]</w:t>
+      </w:r>
+      <w:r>
+        <w:t xml:space="preserve"> </w:t>
+      </w:r>
+      <w:r>
+        <w:t xml:space="preserve">- F6: F4, затем 7-точечная скользящая медиана.</w:t>
+      </w:r>
+      <w:r>
+        <w:t xml:space="preserve">[@pasma2020]</w:t>
+      </w:r>
+    </w:p>
+    <w:p>
+      <w:pPr>
+        <w:pStyle w:val="BodyText"/>
+      </w:pPr>
+      <w:r>
+        <w:t xml:space="preserve">Метка</w:t>
+      </w:r>
+      <w:r>
+        <w:t xml:space="preserve"> </w:t>
+      </w:r>
+      <w:r>
+        <w:rPr>
+          <w:i/>
+          <w:iCs/>
+        </w:rPr>
+        <w:t xml:space="preserve">шум</w:t>
+      </w:r>
+      <w:r>
+        <w:t xml:space="preserve"> </w:t>
+      </w:r>
+      <w:r>
+        <w:t xml:space="preserve">требует также, чтобы медиана абсолютной второй разности кривой была не менее</w:t>
+      </w:r>
+      <w:r>
+        <w:t xml:space="preserve"> </w:t>
+      </w:r>
+      <w:r>
+        <w:t xml:space="preserve">4 мм рт. ст.; размах для метки</w:t>
+      </w:r>
+      <w:r>
+        <w:t xml:space="preserve"> </w:t>
+      </w:r>
+      <w:r>
+        <w:rPr>
+          <w:i/>
+          <w:iCs/>
+        </w:rPr>
+        <w:t xml:space="preserve">ноль</w:t>
+      </w:r>
+      <w:r>
+        <w:t xml:space="preserve"> </w:t>
+      </w:r>
+      <w:r>
+        <w:t xml:space="preserve">— это размах между 2-м и 98-м центилями; систолический подъём —</w:t>
+      </w:r>
+      <w:r>
+        <w:t xml:space="preserve"> </w:t>
+      </w:r>
+      <w:r>
+        <w:t xml:space="preserve">это повышение более чем на 8 мм рт. ст. в пределах 100 мс.</w:t>
+      </w:r>
+    </w:p>
+    <w:p>
+      <w:pPr>
+        <w:pStyle w:val="BodyText"/>
+      </w:pPr>
+      <w:r>
+        <w:t xml:space="preserve">В заранее заданных анализах чувствительности варьировали эталон (длина охранного окна 0 с и 6/30 с,</w:t>
+      </w:r>
+      <w:r>
+        <w:t xml:space="preserve"> </w:t>
+      </w:r>
+      <w:r>
+        <w:t xml:space="preserve">порог пульсового давления 5 и 12 мм рт. ст., валидность минуты 25% и 75%, отказ от заполнения</w:t>
+      </w:r>
+      <w:r>
+        <w:t xml:space="preserve"> </w:t>
+      </w:r>
+      <w:r>
+        <w:t xml:space="preserve">пропусков и среднее по кривой вместо значения монитора), период мониторинга (определённый по</w:t>
+      </w:r>
+      <w:r>
+        <w:t xml:space="preserve"> </w:t>
+      </w:r>
+      <w:r>
+        <w:t xml:space="preserve">числовым данным), набор ковариат (кровопотеря; число измерений креатинина после операции) и исход</w:t>
+      </w:r>
+      <w:r>
+        <w:t xml:space="preserve"> </w:t>
+      </w:r>
+      <w:r>
+        <w:t xml:space="preserve">(ОПП стадии ≥ 2; отсутствие послеоперационного креатинина, учтённое как отсутствие ОПП, S4; включение</w:t>
+      </w:r>
+      <w:r>
+        <w:t xml:space="preserve"> </w:t>
+      </w:r>
+      <w:r>
+        <w:t xml:space="preserve">трансплантации, S6).</w:t>
+      </w:r>
     </w:p>
     <w:p>
       <w:pPr>
         <w:pStyle w:val="Heading2"/>
       </w:pPr>
-      <w:bookmarkStart w:id="16" w:name="_4599127c1056b80a5f4f62032266f39f5a7b907"/>
+      <w:bookmarkStart w:id="16" w:name="_e13181ef1e8f5683f85964243e1cd07424ef14b"/>
+      <w:r>
+        <w:t xml:space="preserve">S7. Дополнительные результаты</w:t>
+      </w:r>
+      <w:bookmarkEnd w:id="16"/>
+    </w:p>
+    <w:p>
+      <w:pPr>
+        <w:pStyle w:val="FirstParagraph"/>
+      </w:pPr>
+      <w:r>
+        <w:rPr>
+          <w:b/>
+          <w:bCs/>
+        </w:rPr>
+        <w:t xml:space="preserve">Включение в набор для анализа ОПП по отделениям</w:t>
+      </w:r>
+      <w:r>
+        <w:t xml:space="preserve"> </w:t>
+      </w:r>
+      <w:r>
+        <w:t xml:space="preserve">(пациенты описательной когорты без</w:t>
+      </w:r>
+      <w:r>
+        <w:t xml:space="preserve"> </w:t>
+      </w:r>
+      <w:r>
+        <w:t xml:space="preserve">трансплантации): торакальная хирургия 96%, урология 97%, общая хирургия 85%, гинекология 28%.</w:t>
+      </w:r>
+    </w:p>
+    <w:p>
+      <w:pPr>
+        <w:pStyle w:val="BodyText"/>
+      </w:pPr>
+      <w:r>
+        <w:rPr>
+          <w:b/>
+          <w:bCs/>
+        </w:rPr>
+        <w:t xml:space="preserve">Эпизоды артефактов.</w:t>
+      </w:r>
+      <w:r>
+        <w:t xml:space="preserve"> </w:t>
+      </w:r>
+      <w:r>
+        <w:t xml:space="preserve">На охранные окна приходилось 1,4% окон. Внутри периода мониторинга кривая</w:t>
+      </w:r>
+      <w:r>
+        <w:t xml:space="preserve"> </w:t>
+      </w:r>
+      <w:r>
+        <w:t xml:space="preserve">никогда не отсутствовала: аналоговый канал ведёт запись непрерывно, а период ограничен валидными</w:t>
+      </w:r>
+      <w:r>
+        <w:t xml:space="preserve"> </w:t>
+      </w:r>
+      <w:r>
+        <w:t xml:space="preserve">данными. В валидных окнах САД монитора и среднее значение по кривой различались более чем на</w:t>
+      </w:r>
+      <w:r>
+        <w:t xml:space="preserve"> </w:t>
+      </w:r>
+      <w:r>
+        <w:t xml:space="preserve">10 мм рт. ст. в медиане 0,5% окон на пациента.</w:t>
+      </w:r>
+    </w:p>
+    <w:tbl>
+      <w:tblPr>
+        <w:tblStyle w:val="Table"/>
+        <w:tblW w:type="pct" w:w="5000"/>
+        <w:tblLayout w:type="fixed"/>
+        <w:tblLook w:firstRow="1" w:lastRow="0" w:firstColumn="0" w:lastColumn="0" w:noHBand="0" w:noVBand="0" w:val="0020"/>
+      </w:tblPr>
+      <w:tblGrid>
+        <w:gridCol w:w="2640"/>
+        <w:gridCol w:w="2640"/>
+        <w:gridCol w:w="2640"/>
+      </w:tblGrid>
+      <w:tr>
+        <w:trPr>
+          <w:tblHeader w:val="on"/>
+        </w:trPr>
+        <w:tc>
+          <w:tcPr/>
+          <w:p>
+            <w:pPr>
+              <w:pStyle w:val="Compact"/>
+            </w:pPr>
+            <w:r>
+              <w:t xml:space="preserve">Тип артефакта</w:t>
+            </w:r>
+          </w:p>
+        </w:tc>
+        <w:tc>
+          <w:tcPr/>
+          <w:p>
+            <w:pPr>
+              <w:pStyle w:val="Compact"/>
+            </w:pPr>
+            <w:r>
+              <w:t xml:space="preserve">Пациенты хотя бы с одним эпизодом</w:t>
+            </w:r>
+          </w:p>
+        </w:tc>
+        <w:tc>
+          <w:tcPr/>
+          <w:p>
+            <w:pPr>
+              <w:pStyle w:val="Compact"/>
+            </w:pPr>
+            <w:r>
+              <w:t xml:space="preserve">Эпизодов на час мониторинга</w:t>
+            </w:r>
+          </w:p>
+        </w:tc>
+      </w:tr>
+      <w:tr>
+        <w:tc>
+          <w:tcPr/>
+          <w:p>
+            <w:pPr>
+              <w:pStyle w:val="Compact"/>
+            </w:pPr>
+            <w:r>
+              <w:t xml:space="preserve">Промывка</w:t>
+            </w:r>
+          </w:p>
+        </w:tc>
+        <w:tc>
+          <w:tcPr/>
+          <w:p>
+            <w:pPr>
+              <w:pStyle w:val="Compact"/>
+            </w:pPr>
+            <w:r>
+              <w:t xml:space="preserve">98%</w:t>
+            </w:r>
+          </w:p>
+        </w:tc>
+        <w:tc>
+          <w:tcPr/>
+          <w:p>
+            <w:pPr>
+              <w:pStyle w:val="Compact"/>
+            </w:pPr>
+            <w:r>
+              <w:t xml:space="preserve">2,6</w:t>
+            </w:r>
+          </w:p>
+        </w:tc>
+      </w:tr>
+      <w:tr>
+        <w:tc>
+          <w:tcPr/>
+          <w:p>
+            <w:pPr>
+              <w:pStyle w:val="Compact"/>
+            </w:pPr>
+            <w:r>
+              <w:t xml:space="preserve">Шум</w:t>
+            </w:r>
+          </w:p>
+        </w:tc>
+        <w:tc>
+          <w:tcPr/>
+          <w:p>
+            <w:pPr>
+              <w:pStyle w:val="Compact"/>
+            </w:pPr>
+            <w:r>
+              <w:t xml:space="preserve">97%</w:t>
+            </w:r>
+          </w:p>
+        </w:tc>
+        <w:tc>
+          <w:tcPr/>
+          <w:p>
+            <w:pPr>
+              <w:pStyle w:val="Compact"/>
+            </w:pPr>
+            <w:r>
+              <w:t xml:space="preserve">2,7</w:t>
+            </w:r>
+          </w:p>
+        </w:tc>
+      </w:tr>
+      <w:tr>
+        <w:tc>
+          <w:tcPr/>
+          <w:p>
+            <w:pPr>
+              <w:pStyle w:val="Compact"/>
+            </w:pPr>
+            <w:r>
+              <w:t xml:space="preserve">Непульсирующий участок</w:t>
+            </w:r>
+          </w:p>
+        </w:tc>
+        <w:tc>
+          <w:tcPr/>
+          <w:p>
+            <w:pPr>
+              <w:pStyle w:val="Compact"/>
+            </w:pPr>
+            <w:r>
+              <w:t xml:space="preserve">90%</w:t>
+            </w:r>
+          </w:p>
+        </w:tc>
+        <w:tc>
+          <w:tcPr/>
+          <w:p>
+            <w:pPr>
+              <w:pStyle w:val="Compact"/>
+            </w:pPr>
+            <w:r>
+              <w:t xml:space="preserve">2,0</w:t>
+            </w:r>
+          </w:p>
+        </w:tc>
+      </w:tr>
+      <w:tr>
+        <w:tc>
+          <w:tcPr/>
+          <w:p>
+            <w:pPr>
+              <w:pStyle w:val="Compact"/>
+            </w:pPr>
+            <w:r>
+              <w:t xml:space="preserve">Обнуление</w:t>
+            </w:r>
+          </w:p>
+        </w:tc>
+        <w:tc>
+          <w:tcPr/>
+          <w:p>
+            <w:pPr>
+              <w:pStyle w:val="Compact"/>
+            </w:pPr>
+            <w:r>
+              <w:t xml:space="preserve">33%</w:t>
+            </w:r>
+          </w:p>
+        </w:tc>
+        <w:tc>
+          <w:tcPr/>
+          <w:p>
+            <w:pPr>
+              <w:pStyle w:val="Compact"/>
+            </w:pPr>
+            <w:r>
+              <w:t xml:space="preserve">0,2</w:t>
+            </w:r>
+          </w:p>
+        </w:tc>
+      </w:tr>
+    </w:tbl>
+    <w:p>
+      <w:pPr>
+        <w:pStyle w:val="FirstParagraph"/>
+      </w:pPr>
+      <w:r>
+        <w:rPr>
+          <w:b/>
+          <w:bCs/>
+        </w:rPr>
+        <w:t xml:space="preserve">Цикл манжеты.</w:t>
+      </w:r>
+      <w:r>
+        <w:t xml:space="preserve"> </w:t>
+      </w:r>
+      <w:r>
+        <w:t xml:space="preserve">На пике, за 22 с до появления нового значения манжеты, артефактом были 25,8% окон</w:t>
+      </w:r>
+      <w:r>
+        <w:t xml:space="preserve"> </w:t>
+      </w:r>
+      <w:r>
+        <w:t xml:space="preserve">кривой против 4,3% за 4–5 мин до этого; доля меток промывки почти не возросла (2,3% против 1,7%).</w:t>
+      </w:r>
+      <w:r>
+        <w:t xml:space="preserve"> </w:t>
+      </w:r>
+      <w:r>
+        <w:t xml:space="preserve">Исходный уровень 4,3% выше 1,8% в остальное время, поскольку включает предыдущий цикл манжеты.</w:t>
+      </w:r>
+      <w:r>
+        <w:t xml:space="preserve"> </w:t>
+      </w:r>
+      <w:r>
+        <w:t xml:space="preserve">Апостериорно (post hoc) превышение наблюдалось как при регулярно повторяющихся измерениях (12,2%</w:t>
+      </w:r>
+      <w:r>
+        <w:t xml:space="preserve"> </w:t>
+      </w:r>
+      <w:r>
+        <w:t xml:space="preserve">окон), которые, вероятно, были автоматическими, так и при нерегулярных (17,0%). У 60% пациентов с</w:t>
+      </w:r>
+      <w:r>
+        <w:t xml:space="preserve"> </w:t>
+      </w:r>
+      <w:r>
+        <w:t xml:space="preserve">катетером в правой и у 31% с катетером в левой лучевой артерии не менее 10% окон кривой в минуту</w:t>
+      </w:r>
+      <w:r>
+        <w:t xml:space="preserve"> </w:t>
+      </w:r>
+      <w:r>
+        <w:t xml:space="preserve">перед измерениями манжетой были артефактами.</w:t>
+      </w:r>
+    </w:p>
+    <w:p>
+      <w:pPr>
+        <w:pStyle w:val="BodyText"/>
+      </w:pPr>
+      <w:r>
+        <w:rPr>
+          <w:b/>
+          <w:bCs/>
+        </w:rPr>
+        <w:t xml:space="preserve">Эпизоды.</w:t>
+      </w:r>
+      <w:r>
+        <w:t xml:space="preserve"> </w:t>
+      </w:r>
+      <w:r>
+        <w:t xml:space="preserve">Из 106 725 зарегистрированных эпизодов в 3909 (3,7%) преобладало охранное окно, а</w:t>
+      </w:r>
+      <w:r>
+        <w:t xml:space="preserve"> </w:t>
+      </w:r>
+      <w:r>
+        <w:t xml:space="preserve">94 345 (88,4%) были физиологическими. Доля помеченных эпизодов длительностью ≤ 30 с с надиром</w:t>
+      </w:r>
+      <w:r>
+        <w:t xml:space="preserve"> </w:t>
+      </w:r>
+      <w:r>
+        <w:t xml:space="preserve">40–54 мм рт. ст. составляла 59–65%.</w:t>
+      </w:r>
+    </w:p>
+    <w:p>
+      <w:pPr>
+        <w:pStyle w:val="BodyText"/>
+      </w:pPr>
+      <w:r>
+        <w:rPr>
+          <w:b/>
+          <w:bCs/>
+        </w:rPr>
+        <w:t xml:space="preserve">Пульс.</w:t>
+      </w:r>
+      <w:r>
+        <w:t xml:space="preserve"> </w:t>
+      </w:r>
+      <w:r>
+        <w:t xml:space="preserve">Одна лишь ЧСС по ЭКГ не позволяет исключить электрическую активность без пульса.</w:t>
+      </w:r>
+      <w:r>
+        <w:t xml:space="preserve"> </w:t>
+      </w:r>
+      <w:r>
+        <w:t xml:space="preserve">Плетизмографический пульс присутствовал как в глубоких помеченных, так и в глубоких физиологических</w:t>
+      </w:r>
+      <w:r>
+        <w:t xml:space="preserve"> </w:t>
+      </w:r>
+      <w:r>
+        <w:t xml:space="preserve">эпизодах (98% и 97,5% окон). Доля непульсирующих окон составила 0,17% у 13 пациентов с</w:t>
+      </w:r>
+      <w:r>
+        <w:t xml:space="preserve"> </w:t>
+      </w:r>
+      <w:r>
+        <w:t xml:space="preserve">предоперационной фибрилляцией предсердий и 0,68% у остальных.</w:t>
+      </w:r>
+    </w:p>
+    <w:p>
+      <w:pPr>
+        <w:pStyle w:val="BodyText"/>
+      </w:pPr>
+      <w:r>
+        <w:rPr>
+          <w:b/>
+          <w:bCs/>
+        </w:rPr>
+        <w:t xml:space="preserve">Внесение и обнаружение.</w:t>
+      </w:r>
+      <w:r>
+        <w:t xml:space="preserve"> </w:t>
+      </w:r>
+      <w:r>
+        <w:t xml:space="preserve">Короткие промывки до 200 мм рт. ст. включительно обнаруживались редко;</w:t>
+      </w:r>
+      <w:r>
+        <w:t xml:space="preserve"> </w:t>
+      </w:r>
+      <w:r>
+        <w:t xml:space="preserve">частичная окклюзия обнаруживалась только при выраженной степени (таблица S8).</w:t>
+      </w:r>
+    </w:p>
+    <w:p>
+      <w:pPr>
+        <w:pStyle w:val="BodyText"/>
+      </w:pPr>
+      <w:r>
+        <w:rPr>
+          <w:b/>
+          <w:bCs/>
+        </w:rPr>
+        <w:t xml:space="preserve">Связь с ОПП.</w:t>
+      </w:r>
+      <w:r>
+        <w:t xml:space="preserve"> </w:t>
+      </w:r>
+      <w:r>
+        <w:t xml:space="preserve">Для ≥ 10 мин ниже 55 мм рт. ст. эталонное ОШ составило 1,95 (0,89–4,27), а на</w:t>
+      </w:r>
+      <w:r>
+        <w:t xml:space="preserve"> </w:t>
+      </w:r>
+      <w:r>
+        <w:t xml:space="preserve">каждые 10 мин ниже 65 мм рт. ст. — 1,08 (0,99–1,17); наклон по конвейеру обработки составил 1,09</w:t>
+      </w:r>
+      <w:r>
+        <w:t xml:space="preserve"> </w:t>
+      </w:r>
+      <w:r>
+        <w:t xml:space="preserve">(1,00–1,18), разность логарифмов шансов — 0,007 (от −0,005 до 0,019). Четыре из 35 ячеек «фильтр ×</w:t>
+      </w:r>
+      <w:r>
+        <w:t xml:space="preserve"> </w:t>
+      </w:r>
+      <w:r>
+        <w:t xml:space="preserve">разрешение» при R2 лежали в пределах 0,002 от верхней границы, по две с каждой стороны; без учёта F6</w:t>
+      </w:r>
+      <w:r>
+        <w:t xml:space="preserve"> </w:t>
+      </w:r>
+      <w:r>
+        <w:t xml:space="preserve">точечные оценки находились в диапазоне от 0,94 до 1,12, а интервалы для влияния разрешения на эталон</w:t>
+      </w:r>
+      <w:r>
+        <w:t xml:space="preserve"> </w:t>
+      </w:r>
+      <w:r>
+        <w:t xml:space="preserve">— от 0,76 до 1,42. Интервал для ОШ исключал 1 в 181 из 420 спецификаций конвейера обработки и в 33 из</w:t>
+      </w:r>
+      <w:r>
+        <w:t xml:space="preserve"> </w:t>
+      </w:r>
+      <w:r>
+        <w:t xml:space="preserve">105 эталонных спецификаций.</w:t>
+      </w:r>
+    </w:p>
+    <w:p>
+      <w:pPr>
+        <w:pStyle w:val="BodyText"/>
+      </w:pPr>
+      <w:r>
+        <w:rPr>
+          <w:b/>
+          <w:bCs/>
+        </w:rPr>
+        <w:t xml:space="preserve">Анализы чувствительности.</w:t>
+      </w:r>
+      <w:r>
+        <w:t xml:space="preserve"> </w:t>
+      </w:r>
+      <w:r>
+        <w:t xml:space="preserve">Интервалы 14 анализов с заключением «эквивалентно» лежали в пределах</w:t>
+      </w:r>
+      <w:r>
+        <w:t xml:space="preserve"> </w:t>
+      </w:r>
+      <w:r>
+        <w:t xml:space="preserve">0,83–1,10; к ним относились исключение гинекологических пациентов и поправка на шкалу риска</w:t>
+      </w:r>
+      <w:r>
+        <w:t xml:space="preserve"> </w:t>
+      </w:r>
+      <w:r>
+        <w:t xml:space="preserve">заболевания. Поправка на кровопотерю и на число измерений креатинина, а также ОПП стадии ≥ 2 дали</w:t>
+      </w:r>
+      <w:r>
+        <w:t xml:space="preserve"> </w:t>
+      </w:r>
+      <w:r>
+        <w:t xml:space="preserve">точечные оценки 0,95–0,97 без интервалов; число измерений креатинина является следствием операции, и</w:t>
+      </w:r>
+      <w:r>
+        <w:t xml:space="preserve"> </w:t>
+      </w:r>
+      <w:r>
+        <w:t xml:space="preserve">этот анализ носит поисковый характер. Эталон на основе среднего по кривой изменяет не только очистку,</w:t>
+      </w:r>
+      <w:r>
+        <w:t xml:space="preserve"> </w:t>
+      </w:r>
+      <w:r>
+        <w:t xml:space="preserve">но и калибровку, поэтому не изолирует обработку артефактов, и реальное различие исключить нельзя.</w:t>
+      </w:r>
+    </w:p>
+    <w:p>
+      <w:pPr>
+        <w:pStyle w:val="BodyText"/>
+      </w:pPr>
+      <w:r>
+        <w:rPr>
+          <w:b/>
+          <w:bCs/>
+        </w:rPr>
+        <w:t xml:space="preserve">Дифференциальная ошибочная классификация.</w:t>
+      </w:r>
+      <w:r>
+        <w:t xml:space="preserve"> </w:t>
+      </w:r>
+      <w:r>
+        <w:t xml:space="preserve">Ложная гипотензия слабо обратно коррелировала с</w:t>
+      </w:r>
+      <w:r>
+        <w:t xml:space="preserve"> </w:t>
+      </w:r>
+      <w:r>
+        <w:t xml:space="preserve">классом ASA (ρ −0,06, p = 0,006). ОШ на единицу log(1 + минуты в час) составило 0,59 (0,12–2,86).</w:t>
+      </w:r>
+      <w:r>
+        <w:t xml:space="preserve"> </w:t>
+      </w:r>
+      <w:r>
+        <w:t xml:space="preserve">Негативный контроль в отдельной модели дал 1,16 (0,95–1,42) на одно SD.</w:t>
+      </w:r>
+    </w:p>
+    <w:p>
+      <w:pPr>
+        <w:pStyle w:val="Heading1"/>
+      </w:pPr>
+      <w:bookmarkStart w:id="17" w:name="_6a192ab095230096d452e33d378527ac22c9cab"/>
+      <w:r>
+        <w:t xml:space="preserve">Дополнительные таблицы</w:t>
+      </w:r>
+      <w:bookmarkEnd w:id="17"/>
+    </w:p>
+    <w:p>
+      <w:pPr>
+        <w:pStyle w:val="Heading2"/>
+      </w:pPr>
+      <w:bookmarkStart w:id="18" w:name="_4599127c1056b80a5f4f62032266f39f5a7b907"/>
       <w:r>
         <w:t xml:space="preserve">Таблица S1. Зарегистрированные минуты с САД &lt; 65 мм рт. ст., классифицированные по сравнению с эталоном (описательная когорта)</w:t>
       </w:r>
-      <w:bookmarkEnd w:id="16"/>
+      <w:bookmarkEnd w:id="18"/>
     </w:p>
     <w:tbl>
       <w:tblPr>
@@ -3115,11 +3853,11 @@
       <w:pPr>
         <w:pStyle w:val="Heading2"/>
       </w:pPr>
-      <w:bookmarkStart w:id="17" w:name="_e145224db6743a23c30bd0bc58062aa3501607f"/>
+      <w:bookmarkStart w:id="19" w:name="_e145224db6743a23c30bd0bc58062aa3501607f"/>
       <w:r>
         <w:t xml:space="preserve">Таблица S2. Согласие бинарной экспозиции (≥ 10 мин с САД &lt; 65) с эталоном (описательная когорта)</w:t>
       </w:r>
-      <w:bookmarkEnd w:id="17"/>
+      <w:bookmarkEnd w:id="19"/>
     </w:p>
     <w:tbl>
       <w:tblPr>
@@ -8379,11 +9117,11 @@
       <w:pPr>
         <w:pStyle w:val="Heading2"/>
       </w:pPr>
-      <w:bookmarkStart w:id="18" w:name="_f9cc236266fe4f2de1fc2508dcb3ba410176cb7"/>
+      <w:bookmarkStart w:id="20" w:name="_f9cc236266fe4f2de1fc2508dcb3ba410176cb7"/>
       <w:r>
         <w:t xml:space="preserve">Таблица S3. АПОСТЕРИОРНО (POST HOC): вероятность того, что эпизод помечен по кривой как артефакт, в зависимости от прошедшего времени и надира к этому моменту</w:t>
       </w:r>
-      <w:bookmarkEnd w:id="18"/>
+      <w:bookmarkEnd w:id="20"/>
     </w:p>
     <w:tbl>
       <w:tblPr>
@@ -9196,11 +9934,11 @@
       <w:pPr>
         <w:pStyle w:val="Heading2"/>
       </w:pPr>
-      <w:bookmarkStart w:id="19" w:name="_3b2ab356a3f6585ffcb652c3c447bd6217318a4"/>
+      <w:bookmarkStart w:id="21" w:name="_3b2ab356a3f6585ffcb652c3c447bd6217318a4"/>
       <w:r>
         <w:t xml:space="preserve">Таблица S4. АПОСТЕРИОРНО (POST HOC): экспозиции, взвешенные по глубине, и более низкие пороговые значения (разрешение «медиана за 1 мин»)</w:t>
       </w:r>
-      <w:bookmarkEnd w:id="19"/>
+      <w:bookmarkEnd w:id="21"/>
     </w:p>
     <w:tbl>
       <w:tblPr>
@@ -11309,11 +12047,11 @@
       <w:pPr>
         <w:pStyle w:val="Heading2"/>
       </w:pPr>
-      <w:bookmarkStart w:id="20" w:name="_b362238bfdb0ad595d5d8d0680d57d9553ba63f"/>
+      <w:bookmarkStart w:id="22" w:name="_b362238bfdb0ad595d5d8d0680d57d9553ba63f"/>
       <w:r>
         <w:t xml:space="preserve">Таблица S5. Анализы чувствительности основного ROR (F1 × R3)</w:t>
       </w:r>
-      <w:bookmarkEnd w:id="20"/>
+      <w:bookmarkEnd w:id="22"/>
     </w:p>
     <w:tbl>
       <w:tblPr>
@@ -12780,11 +13518,11 @@
       <w:pPr>
         <w:pStyle w:val="Heading2"/>
       </w:pPr>
-      <w:bookmarkStart w:id="21" w:name="_bf0f0068a8a4b58c3ca9d31e3a5c6f10af4a73a"/>
+      <w:bookmarkStart w:id="23" w:name="_bf0f0068a8a4b58c3ca9d31e3a5c6f10af4a73a"/>
       <w:r>
         <w:t xml:space="preserve">Таблица S6. Дифференциальная ошибка классификации: ОПП в зависимости от числа ложных минут в час с поправкой на эталонную экспозицию</w:t>
       </w:r>
-      <w:bookmarkEnd w:id="21"/>
+      <w:bookmarkEnd w:id="23"/>
     </w:p>
     <w:tbl>
       <w:tblPr>
@@ -15167,11 +15905,11 @@
       <w:pPr>
         <w:pStyle w:val="Heading2"/>
       </w:pPr>
-      <w:bookmarkStart w:id="22" w:name="_9334920b5fbf36d8e4e2ef2500e2ba1a42d13d6"/>
+      <w:bookmarkStart w:id="24" w:name="_9334920b5fbf36d8e4e2ef2500e2ba1a42d13d6"/>
       <w:r>
         <w:t xml:space="preserve">Таблица S7. Пациенты с расхождением, операционные характеристики решения об эквивалентности и покрытие интервалов</w:t>
       </w:r>
-      <w:bookmarkEnd w:id="22"/>
+      <w:bookmarkEnd w:id="24"/>
     </w:p>
     <w:tbl>
       <w:tblPr>
@@ -16332,11 +17070,11 @@
       <w:pPr>
         <w:pStyle w:val="Heading2"/>
       </w:pPr>
-      <w:bookmarkStart w:id="23" w:name="_fee191f90e71920cdd2ae47219cb916b3c21e59"/>
+      <w:bookmarkStart w:id="25" w:name="_fee191f90e71920cdd2ae47219cb916b3c21e59"/>
       <w:r>
         <w:t xml:space="preserve">Таблица S8. Перебор параметров внесения–обнаружения (апостериорно (post hoc))</w:t>
       </w:r>
-      <w:bookmarkEnd w:id="23"/>
+      <w:bookmarkEnd w:id="25"/>
     </w:p>
     <w:tbl>
       <w:tblPr>
@@ -18345,11 +19083,11 @@
       <w:pPr>
         <w:pStyle w:val="Heading2"/>
       </w:pPr>
-      <w:bookmarkStart w:id="24" w:name="_fbf632dfd53bb9cfa33be3de87b43dc7940b226"/>
+      <w:bookmarkStart w:id="26" w:name="_fbf632dfd53bb9cfa33be3de87b43dc7940b226"/>
       <w:r>
         <w:t xml:space="preserve">Таблица S9. Слепая оценка ИИ 152 фрагментов (вторичный анализ)</w:t>
       </w:r>
-      <w:bookmarkEnd w:id="24"/>
+      <w:bookmarkEnd w:id="26"/>
     </w:p>
     <w:tbl>
       <w:tblPr>
@@ -18681,11 +19419,11 @@
       <w:pPr>
         <w:pStyle w:val="Heading2"/>
       </w:pPr>
-      <w:bookmarkStart w:id="25" w:name="_01d1008d06f21e3fd92274a23aa494d34391c47"/>
+      <w:bookmarkStart w:id="27" w:name="_01d1008d06f21e3fd92274a23aa494d34391c47"/>
       <w:r>
         <w:t xml:space="preserve">Таблица S10. Внутрибольничная летальность (поисковый анализ, сокращённый набор поправочных переменных)</w:t>
       </w:r>
-      <w:bookmarkEnd w:id="25"/>
+      <w:bookmarkEnd w:id="27"/>
     </w:p>
     <w:p>
       <w:pPr>
@@ -18699,11 +19437,11 @@
       <w:pPr>
         <w:pStyle w:val="Heading2"/>
       </w:pPr>
-      <w:bookmarkStart w:id="26" w:name="_f39342d8fae8a944d89ecf8470fb36a2393b905"/>
+      <w:bookmarkStart w:id="28" w:name="_f39342d8fae8a944d89ecf8470fb36a2393b905"/>
       <w:r>
         <w:t xml:space="preserve">Таблица S11. ОШ ОПП в зависимости от уровня поправки (набор для анализа ОПП, медиана за 1 мин)</w:t>
       </w:r>
-      <w:bookmarkEnd w:id="26"/>
+      <w:bookmarkEnd w:id="28"/>
     </w:p>
     <w:tbl>
       <w:tblPr>
@@ -20096,11 +20834,11 @@
       <w:pPr>
         <w:pStyle w:val="Heading1"/>
       </w:pPr>
-      <w:bookmarkStart w:id="27" w:name="_bb5ea490873b166758752aff915190423aa5bcc"/>
+      <w:bookmarkStart w:id="29" w:name="_bb5ea490873b166758752aff915190423aa5bcc"/>
       <w:r>
         <w:t xml:space="preserve">Дополнительные рисунки</w:t>
       </w:r>
-      <w:bookmarkEnd w:id="27"/>
+      <w:bookmarkEnd w:id="29"/>
     </w:p>
     <w:p>
       <w:pPr>
@@ -20111,18 +20849,18 @@
           <wp:inline>
             <wp:extent cx="4800600" cy="5171476"/>
             <wp:effectExtent b="0" l="0" r="0" t="0"/>
-            <wp:docPr descr="Рисунок S1. Отбор пациентов." title="" id="29" name="Picture"/>
+            <wp:docPr descr="Рисунок S1. Отбор пациентов." title="" id="31" name="Picture"/>
             <a:graphic>
               <a:graphicData uri="http://schemas.openxmlformats.org/drawingml/2006/picture">
                 <pic:pic>
                   <pic:nvPicPr>
-                    <pic:cNvPr descr="figures/figS1_flow_ru.png" id="30" name="Picture"/>
+                    <pic:cNvPr descr="figures/figS1_flow_ru.png" id="32" name="Picture"/>
                     <pic:cNvPicPr>
                       <a:picLocks noChangeArrowheads="1" noChangeAspect="1"/>
                     </pic:cNvPicPr>
                   </pic:nvPicPr>
                   <pic:blipFill>
-                    <a:blip r:embed="rId28"/>
+                    <a:blip r:embed="rId30"/>
                     <a:stretch>
                       <a:fillRect/>
                     </a:stretch>
@@ -20166,18 +20904,18 @@
           <wp:inline>
             <wp:extent cx="4800600" cy="3972652"/>
             <wp:effectExtent b="0" l="0" r="0" t="0"/>
-            <wp:docPr descr="Рисунок S2. Кривая спецификаций: 420 вариантов обработки." title="" id="32" name="Picture"/>
+            <wp:docPr descr="Рисунок S2. Кривая спецификаций: 420 вариантов обработки." title="" id="34" name="Picture"/>
             <a:graphic>
               <a:graphicData uri="http://schemas.openxmlformats.org/drawingml/2006/picture">
                 <pic:pic>
                   <pic:nvPicPr>
-                    <pic:cNvPr descr="figures/fig3_spec_curve_ru.png" id="33" name="Picture"/>
+                    <pic:cNvPr descr="figures/fig3_spec_curve_ru.png" id="35" name="Picture"/>
                     <pic:cNvPicPr>
                       <a:picLocks noChangeArrowheads="1" noChangeAspect="1"/>
                     </pic:cNvPicPr>
                   </pic:nvPicPr>
                   <pic:blipFill>
-                    <a:blip r:embed="rId31"/>
+                    <a:blip r:embed="rId33"/>
                     <a:stretch>
                       <a:fillRect/>
                     </a:stretch>
@@ -20221,18 +20959,18 @@
           <wp:inline>
             <wp:extent cx="4800600" cy="2381737"/>
             <wp:effectExtent b="0" l="0" r="0" t="0"/>
-            <wp:docPr descr="Рисунок S3. Вероятность того, что эпизод помечен как артефакт, по длительности и минимуму." title="" id="35" name="Picture"/>
+            <wp:docPr descr="Рисунок S3. Вероятность того, что эпизод помечен как артефакт, по длительности и минимуму." title="" id="37" name="Picture"/>
             <a:graphic>
               <a:graphicData uri="http://schemas.openxmlformats.org/drawingml/2006/picture">
                 <pic:pic>
                   <pic:nvPicPr>
-                    <pic:cNvPr descr="figures/fig4_episode_probability_ru.png" id="36" name="Picture"/>
+                    <pic:cNvPr descr="figures/fig4_episode_probability_ru.png" id="38" name="Picture"/>
                     <pic:cNvPicPr>
                       <a:picLocks noChangeArrowheads="1" noChangeAspect="1"/>
                     </pic:cNvPicPr>
                   </pic:nvPicPr>
                   <pic:blipFill>
-                    <a:blip r:embed="rId34"/>
+                    <a:blip r:embed="rId36"/>
                     <a:stretch>
                       <a:fillRect/>
                     </a:stretch>
@@ -20276,18 +21014,18 @@
           <wp:inline>
             <wp:extent cx="4800600" cy="1925753"/>
             <wp:effectExtent b="0" l="0" r="0" t="0"/>
-            <wp:docPr descr="Рисунок S4. Отношение отношений шансов по фильтру, метрике и порогу (апостериорно)." title="" id="38" name="Picture"/>
+            <wp:docPr descr="Рисунок S4. Отношение отношений шансов по фильтру, метрике и порогу (апостериорно)." title="" id="40" name="Picture"/>
             <a:graphic>
               <a:graphicData uri="http://schemas.openxmlformats.org/drawingml/2006/picture">
                 <pic:pic>
                   <pic:nvPicPr>
-                    <pic:cNvPr descr="figures/fig3_depth_heatmap_ru.png" id="39" name="Picture"/>
+                    <pic:cNvPr descr="figures/fig3_depth_heatmap_ru.png" id="41" name="Picture"/>
                     <pic:cNvPicPr>
                       <a:picLocks noChangeArrowheads="1" noChangeAspect="1"/>
                     </pic:cNvPicPr>
                   </pic:nvPicPr>
                   <pic:blipFill>
-                    <a:blip r:embed="rId37"/>
+                    <a:blip r:embed="rId39"/>
                     <a:stretch>
                       <a:fillRect/>
                     </a:stretch>
@@ -20326,21 +21064,21 @@
       <w:pPr>
         <w:pStyle w:val="Heading1"/>
       </w:pPr>
-      <w:bookmarkStart w:id="40" w:name="_73d283307399a527e45809823a8a1f41f08babd"/>
+      <w:bookmarkStart w:id="42" w:name="_73d283307399a527e45809823a8a1f41f08babd"/>
       <w:r>
         <w:t xml:space="preserve">Дополнительный протокол</w:t>
       </w:r>
-      <w:bookmarkEnd w:id="40"/>
+      <w:bookmarkEnd w:id="42"/>
     </w:p>
     <w:p>
       <w:pPr>
         <w:pStyle w:val="Heading2"/>
       </w:pPr>
-      <w:bookmarkStart w:id="41" w:name="_2803707cd65e2ae340a65fffb8fcbdbdf267999"/>
+      <w:bookmarkStart w:id="43" w:name="_2803707cd65e2ae340a65fffb8fcbdbdf267999"/>
       <w:r>
         <w:t xml:space="preserve">Протокол анализа (зафиксирован до любого анализа исходов)</w:t>
       </w:r>
-      <w:bookmarkEnd w:id="41"/>
+      <w:bookmarkEnd w:id="43"/>
     </w:p>
     <w:p>
       <w:pPr>
@@ -20554,11 +21292,11 @@
       <w:pPr>
         <w:pStyle w:val="Heading3"/>
       </w:pPr>
-      <w:bookmarkStart w:id="42" w:name="_цели"/>
+      <w:bookmarkStart w:id="44" w:name="_цели"/>
       <w:r>
         <w:t xml:space="preserve">1. Цели</w:t>
       </w:r>
-      <w:bookmarkEnd w:id="42"/>
+      <w:bookmarkEnd w:id="44"/>
     </w:p>
     <w:tbl>
       <w:tblPr>
@@ -20845,11 +21583,11 @@
       <w:pPr>
         <w:pStyle w:val="Heading3"/>
       </w:pPr>
-      <w:bookmarkStart w:id="43" w:name="_cf545e65229c2dd7d1c6b7c9feacad334404118"/>
+      <w:bookmarkStart w:id="45" w:name="_cf545e65229c2dd7d1c6b7c9feacad334404118"/>
       <w:r>
         <w:t xml:space="preserve">2. Данные и когорта</w:t>
       </w:r>
-      <w:bookmarkEnd w:id="43"/>
+      <w:bookmarkEnd w:id="45"/>
     </w:p>
     <w:p>
       <w:pPr>
@@ -20934,11 +21672,11 @@
       <w:pPr>
         <w:pStyle w:val="Heading3"/>
       </w:pPr>
-      <w:bookmarkStart w:id="44" w:name="_5da11f8085fd5652044672ce3d2990cdb023388"/>
+      <w:bookmarkStart w:id="46" w:name="_5da11f8085fd5652044672ce3d2990cdb023388"/>
       <w:r>
         <w:t xml:space="preserve">3. Эталонный ряд (с учётом кривой)</w:t>
       </w:r>
-      <w:bookmarkEnd w:id="44"/>
+      <w:bookmarkEnd w:id="46"/>
     </w:p>
     <w:p>
       <w:pPr>
@@ -21186,11 +21924,11 @@
       <w:pPr>
         <w:pStyle w:val="Heading3"/>
       </w:pPr>
-      <w:bookmarkStart w:id="45" w:name="_ae336afa8a893368c8a138f9a32c3171a64fca1"/>
+      <w:bookmarkStart w:id="47" w:name="_ae336afa8a893368c8a138f9a32c3171a64fca1"/>
       <w:r>
         <w:t xml:space="preserve">4. Конвейеры обработки (мультивселенная)</w:t>
       </w:r>
-      <w:bookmarkEnd w:id="45"/>
+      <w:bookmarkEnd w:id="47"/>
     </w:p>
     <w:p>
       <w:pPr>
@@ -21637,11 +22375,11 @@
       <w:pPr>
         <w:pStyle w:val="Heading3"/>
       </w:pPr>
-      <w:bookmarkStart w:id="46" w:name="_6ed6310f7b1c21eaf0de6bdf2075ec5dd26915f"/>
+      <w:bookmarkStart w:id="48" w:name="_6ed6310f7b1c21eaf0de6bdf2075ec5dd26915f"/>
       <w:r>
         <w:t xml:space="preserve">5. Исходы и ковариаты</w:t>
       </w:r>
-      <w:bookmarkEnd w:id="46"/>
+      <w:bookmarkEnd w:id="48"/>
     </w:p>
     <w:p>
       <w:pPr>
@@ -21773,11 +22511,11 @@
       <w:pPr>
         <w:pStyle w:val="Heading3"/>
       </w:pPr>
-      <w:bookmarkStart w:id="47" w:name="_dfd4580f603f67fb3ab212cb6813ce35a21cfc1"/>
+      <w:bookmarkStart w:id="49" w:name="_dfd4580f603f67fb3ab212cb6813ce35a21cfc1"/>
       <w:r>
         <w:t xml:space="preserve">6. Статистический анализ</w:t>
       </w:r>
-      <w:bookmarkEnd w:id="47"/>
+      <w:bookmarkEnd w:id="49"/>
     </w:p>
     <w:p>
       <w:pPr>
@@ -22253,11 +22991,11 @@
       <w:pPr>
         <w:pStyle w:val="Heading3"/>
       </w:pPr>
-      <w:bookmarkStart w:id="48" w:name="_e9166d7c4c7ab6206e490edd8a1dfc5cb217109"/>
+      <w:bookmarkStart w:id="50" w:name="_e9166d7c4c7ab6206e490edd8a1dfc5cb217109"/>
       <w:r>
         <w:t xml:space="preserve">7. Валидация эталона</w:t>
       </w:r>
-      <w:bookmarkEnd w:id="48"/>
+      <w:bookmarkEnd w:id="50"/>
     </w:p>
     <w:p>
       <w:pPr>
@@ -22413,11 +23151,11 @@
       <w:pPr>
         <w:pStyle w:val="Heading3"/>
       </w:pPr>
-      <w:bookmarkStart w:id="49" w:name="_69ca0ee630ee8d41cc9524b0db544b066d995eb"/>
+      <w:bookmarkStart w:id="51" w:name="_69ca0ee630ee8d41cc9524b0db544b066d995eb"/>
       <w:r>
         <w:t xml:space="preserve">8. Анализы чувствительности</w:t>
       </w:r>
-      <w:bookmarkEnd w:id="49"/>
+      <w:bookmarkEnd w:id="51"/>
     </w:p>
     <w:tbl>
       <w:tblPr>
@@ -22654,11 +23392,11 @@
       <w:pPr>
         <w:pStyle w:val="Heading3"/>
       </w:pPr>
-      <w:bookmarkStart w:id="50" w:name="_d2597609fa8a8330ae713f1febfeeb572c1dea4"/>
+      <w:bookmarkStart w:id="52" w:name="_d2597609fa8a8330ae713f1febfeeb572c1dea4"/>
       <w:r>
         <w:t xml:space="preserve">9. Чего это исследование показать не может</w:t>
       </w:r>
-      <w:bookmarkEnd w:id="50"/>
+      <w:bookmarkEnd w:id="52"/>
     </w:p>
     <w:p>
       <w:pPr>
@@ -22724,11 +23462,11 @@
       <w:pPr>
         <w:pStyle w:val="Heading3"/>
       </w:pPr>
-      <w:bookmarkStart w:id="51" w:name="_e355b1a78ae844f0bd9aea3b7bb35c4f2259cbc"/>
+      <w:bookmarkStart w:id="53" w:name="_e355b1a78ae844f0bd9aea3b7bb35c4f2259cbc"/>
       <w:r>
         <w:t xml:space="preserve">Поправки (2026-10-26, до фиксации, после состязательной методологической рецензии; данные исходов не рассматривались)</w:t>
       </w:r>
-      <w:bookmarkEnd w:id="51"/>
+      <w:bookmarkEnd w:id="53"/>
     </w:p>
     <w:p>
       <w:pPr>
@@ -23961,11 +24699,11 @@
       <w:pPr>
         <w:pStyle w:val="Heading3"/>
       </w:pPr>
-      <w:bookmarkStart w:id="52" w:name="_ae2e2af4d5fd08854f8e49023ab1f4768b41a12"/>
+      <w:bookmarkStart w:id="54" w:name="_ae2e2af4d5fd08854f8e49023ab1f4768b41a12"/>
       <w:r>
         <w:t xml:space="preserve">Записи после раскрытия</w:t>
       </w:r>
-      <w:bookmarkEnd w:id="52"/>
+      <w:bookmarkEnd w:id="54"/>
     </w:p>
     <w:p>
       <w:pPr>

</xml_diff>